<commit_message>
Aggiorna Prompt; rimuovi file temporanei Office; ignora lock Excel/Word (~$*)
Co-authored-by: Cursor <cursoragent@cursor.com>
</commit_message>
<xml_diff>
--- a/Prompt/Prompt_PMAPP3.docx
+++ b/Prompt/Prompt_PMAPP3.docx
@@ -4402,6 +4402,124 @@
       <w:proofErr w:type="spellEnd"/>
       <w:r>
         <w:t>: TAB pazienti in ARRIVO. Accanto a “IN ARRIVO” tra parentesi il numero totale. Poi quattro pallini colorati con il numero di quanti pazienti, per quello stato, hanno quel codice colore.</w:t>
+      </w:r>
+    </w:p>
+    <w:p>
+      <w:pPr>
+        <w:pStyle w:val="Titolo1"/>
+      </w:pPr>
+      <w:r>
+        <w:t>PMAPP V5.</w:t>
+      </w:r>
+      <w:r>
+        <w:t>2</w:t>
+      </w:r>
+    </w:p>
+    <w:p>
+      <w:pPr>
+        <w:pStyle w:val="Paragrafoelenco"/>
+        <w:numPr>
+          <w:ilvl w:val="0"/>
+          <w:numId w:val="24"/>
+        </w:numPr>
+      </w:pPr>
+      <w:r>
+        <w:t>Dashboard PMA: metti i pulsanti NUOVO PAZIENTE, PAZIENTI DIMESSI e IMPOSTAZIONI PMA su un’unica riga e rendili tutti della stessa dimensione.</w:t>
+      </w:r>
+    </w:p>
+    <w:p>
+      <w:pPr>
+        <w:pStyle w:val="Paragrafoelenco"/>
+        <w:numPr>
+          <w:ilvl w:val="0"/>
+          <w:numId w:val="24"/>
+        </w:numPr>
+      </w:pPr>
+      <w:r>
+        <w:lastRenderedPageBreak/>
+        <w:t>Nella scheda paziente in GENERALI crea un piccolo campo “Infermiere riferimento:” q</w:t>
+      </w:r>
+      <w:r>
+        <w:t xml:space="preserve">uando un utente con RANK INFERMIERE apre la scheda paziente per la prima volta per il suo RANK (ovvero il primo infermiere che apre la scheda) </w:t>
+      </w:r>
+      <w:r>
+        <w:t>viene stampato il suo nome utente. Non cambiano i privilegi su quel paziente ma è solo per ricordarsi chi lo ha in carico. Nella sua dashboard PMA questi pazienti risultano in cima alla lista (sottotitolo “IN CARICO A ME”). Poi fai la stessa cosa per l’utente con RANK “MEDICO”.</w:t>
+      </w:r>
+    </w:p>
+    <w:p>
+      <w:pPr>
+        <w:pStyle w:val="Paragrafoelenco"/>
+        <w:numPr>
+          <w:ilvl w:val="0"/>
+          <w:numId w:val="24"/>
+        </w:numPr>
+      </w:pPr>
+      <w:r>
+        <w:t xml:space="preserve">Nella lista PAZIENTI IN CARICO mostra accanto al nome paziente infermiere e medico di </w:t>
+      </w:r>
+      <w:proofErr w:type="spellStart"/>
+      <w:r>
+        <w:t>riferiment</w:t>
+      </w:r>
+      <w:proofErr w:type="spellEnd"/>
+    </w:p>
+    <w:p>
+      <w:pPr>
+        <w:pStyle w:val="Paragrafoelenco"/>
+        <w:numPr>
+          <w:ilvl w:val="0"/>
+          <w:numId w:val="24"/>
+        </w:numPr>
+      </w:pPr>
+      <w:r>
+        <w:t>Ottimizza la DASHBOARD CENTRALE di cui ti allego uno screen, fa schifo. Tendenzialmente c’è aperto un solo PMA per volta. L’operatore RANK CENTRALE deve avere sott’occhio la situazione ben chiara. Per ogni PMA quanti pazienti ha in carico e di che colore, poi pazienti in attesa e pazienti in arrivo. Sempre da questa schermata crea il pulsante “NUOVO PAZIENTE” in modo che l’operatore possa creare un nuovo paziente che sta inviando al PMA.</w:t>
+      </w:r>
+    </w:p>
+    <w:p>
+      <w:pPr>
+        <w:pStyle w:val="Titolo1"/>
+      </w:pPr>
+      <w:r>
+        <w:t>PMAPP V5.</w:t>
+      </w:r>
+      <w:r>
+        <w:t>3</w:t>
+      </w:r>
+    </w:p>
+    <w:p>
+      <w:pPr>
+        <w:pStyle w:val="Paragrafoelenco"/>
+        <w:numPr>
+          <w:ilvl w:val="0"/>
+          <w:numId w:val="25"/>
+        </w:numPr>
+      </w:pPr>
+      <w:r>
+        <w:t>Pulsanti NUOVO PAZIENTE, PAZIENTI DIMESSI, IMPOSTAZIONI PMA devono esser tutti scritti in maiuscolo e nella dashboard PMA avere questo ordine</w:t>
+      </w:r>
+    </w:p>
+    <w:p>
+      <w:pPr>
+        <w:pStyle w:val="Paragrafoelenco"/>
+        <w:numPr>
+          <w:ilvl w:val="0"/>
+          <w:numId w:val="25"/>
+        </w:numPr>
+      </w:pPr>
+      <w:r>
+        <w:t>Pulsanti in alto per vista tablet e smartphone: NB devono essere ben ottimizzate! Ad es. ingrandisci i pulsanti se serve o riorganizza le viste comprimendo il menu a sinistra</w:t>
+      </w:r>
+    </w:p>
+    <w:p>
+      <w:pPr>
+        <w:pStyle w:val="Paragrafoelenco"/>
+        <w:numPr>
+          <w:ilvl w:val="0"/>
+          <w:numId w:val="25"/>
+        </w:numPr>
+      </w:pPr>
+      <w:r>
+        <w:t>In impostazione il campo impostazioni “DETTAGLIO EO RAPIDO” NON deve mai essere ordinato in ordine alfabetico ma come lo ha definito l’utente. I vari “Dettaglio evento per tipo” invece devono avere quel comando.</w:t>
       </w:r>
     </w:p>
     <w:p/>
@@ -6291,6 +6409,119 @@
     </w:lvl>
   </w:abstractNum>
   <w:abstractNum w:abstractNumId="17" w15:restartNumberingAfterBreak="0">
+    <w:nsid w:val="5B2D03E6"/>
+    <w:multiLevelType w:val="hybridMultilevel"/>
+    <w:tmpl w:val="8EB8ACF8"/>
+    <w:lvl w:ilvl="0" w:tplc="08090001">
+      <w:start w:val="1"/>
+      <w:numFmt w:val="bullet"/>
+      <w:lvlText w:val=""/>
+      <w:lvlJc w:val="left"/>
+      <w:pPr>
+        <w:ind w:left="720" w:hanging="360"/>
+      </w:pPr>
+      <w:rPr>
+        <w:rFonts w:ascii="Symbol" w:hAnsi="Symbol" w:hint="default"/>
+      </w:rPr>
+    </w:lvl>
+    <w:lvl w:ilvl="1" w:tplc="08090003" w:tentative="1">
+      <w:start w:val="1"/>
+      <w:numFmt w:val="bullet"/>
+      <w:lvlText w:val="o"/>
+      <w:lvlJc w:val="left"/>
+      <w:pPr>
+        <w:ind w:left="1440" w:hanging="360"/>
+      </w:pPr>
+      <w:rPr>
+        <w:rFonts w:ascii="Courier New" w:hAnsi="Courier New" w:cs="Courier New" w:hint="default"/>
+      </w:rPr>
+    </w:lvl>
+    <w:lvl w:ilvl="2" w:tplc="08090005" w:tentative="1">
+      <w:start w:val="1"/>
+      <w:numFmt w:val="bullet"/>
+      <w:lvlText w:val=""/>
+      <w:lvlJc w:val="left"/>
+      <w:pPr>
+        <w:ind w:left="2160" w:hanging="360"/>
+      </w:pPr>
+      <w:rPr>
+        <w:rFonts w:ascii="Wingdings" w:hAnsi="Wingdings" w:hint="default"/>
+      </w:rPr>
+    </w:lvl>
+    <w:lvl w:ilvl="3" w:tplc="08090001" w:tentative="1">
+      <w:start w:val="1"/>
+      <w:numFmt w:val="bullet"/>
+      <w:lvlText w:val=""/>
+      <w:lvlJc w:val="left"/>
+      <w:pPr>
+        <w:ind w:left="2880" w:hanging="360"/>
+      </w:pPr>
+      <w:rPr>
+        <w:rFonts w:ascii="Symbol" w:hAnsi="Symbol" w:hint="default"/>
+      </w:rPr>
+    </w:lvl>
+    <w:lvl w:ilvl="4" w:tplc="08090003" w:tentative="1">
+      <w:start w:val="1"/>
+      <w:numFmt w:val="bullet"/>
+      <w:lvlText w:val="o"/>
+      <w:lvlJc w:val="left"/>
+      <w:pPr>
+        <w:ind w:left="3600" w:hanging="360"/>
+      </w:pPr>
+      <w:rPr>
+        <w:rFonts w:ascii="Courier New" w:hAnsi="Courier New" w:cs="Courier New" w:hint="default"/>
+      </w:rPr>
+    </w:lvl>
+    <w:lvl w:ilvl="5" w:tplc="08090005" w:tentative="1">
+      <w:start w:val="1"/>
+      <w:numFmt w:val="bullet"/>
+      <w:lvlText w:val=""/>
+      <w:lvlJc w:val="left"/>
+      <w:pPr>
+        <w:ind w:left="4320" w:hanging="360"/>
+      </w:pPr>
+      <w:rPr>
+        <w:rFonts w:ascii="Wingdings" w:hAnsi="Wingdings" w:hint="default"/>
+      </w:rPr>
+    </w:lvl>
+    <w:lvl w:ilvl="6" w:tplc="08090001" w:tentative="1">
+      <w:start w:val="1"/>
+      <w:numFmt w:val="bullet"/>
+      <w:lvlText w:val=""/>
+      <w:lvlJc w:val="left"/>
+      <w:pPr>
+        <w:ind w:left="5040" w:hanging="360"/>
+      </w:pPr>
+      <w:rPr>
+        <w:rFonts w:ascii="Symbol" w:hAnsi="Symbol" w:hint="default"/>
+      </w:rPr>
+    </w:lvl>
+    <w:lvl w:ilvl="7" w:tplc="08090003" w:tentative="1">
+      <w:start w:val="1"/>
+      <w:numFmt w:val="bullet"/>
+      <w:lvlText w:val="o"/>
+      <w:lvlJc w:val="left"/>
+      <w:pPr>
+        <w:ind w:left="5760" w:hanging="360"/>
+      </w:pPr>
+      <w:rPr>
+        <w:rFonts w:ascii="Courier New" w:hAnsi="Courier New" w:cs="Courier New" w:hint="default"/>
+      </w:rPr>
+    </w:lvl>
+    <w:lvl w:ilvl="8" w:tplc="08090005" w:tentative="1">
+      <w:start w:val="1"/>
+      <w:numFmt w:val="bullet"/>
+      <w:lvlText w:val=""/>
+      <w:lvlJc w:val="left"/>
+      <w:pPr>
+        <w:ind w:left="6480" w:hanging="360"/>
+      </w:pPr>
+      <w:rPr>
+        <w:rFonts w:ascii="Wingdings" w:hAnsi="Wingdings" w:hint="default"/>
+      </w:rPr>
+    </w:lvl>
+  </w:abstractNum>
+  <w:abstractNum w:abstractNumId="18" w15:restartNumberingAfterBreak="0">
     <w:nsid w:val="64A277F6"/>
     <w:multiLevelType w:val="hybridMultilevel"/>
     <w:tmpl w:val="CF08F8FC"/>
@@ -6403,7 +6634,7 @@
       </w:rPr>
     </w:lvl>
   </w:abstractNum>
-  <w:abstractNum w:abstractNumId="18" w15:restartNumberingAfterBreak="0">
+  <w:abstractNum w:abstractNumId="19" w15:restartNumberingAfterBreak="0">
     <w:nsid w:val="65372B50"/>
     <w:multiLevelType w:val="hybridMultilevel"/>
     <w:tmpl w:val="A5D0BCB4"/>
@@ -6516,7 +6747,120 @@
       </w:rPr>
     </w:lvl>
   </w:abstractNum>
-  <w:abstractNum w:abstractNumId="19" w15:restartNumberingAfterBreak="0">
+  <w:abstractNum w:abstractNumId="20" w15:restartNumberingAfterBreak="0">
+    <w:nsid w:val="66853EE5"/>
+    <w:multiLevelType w:val="hybridMultilevel"/>
+    <w:tmpl w:val="4D5E9B4C"/>
+    <w:lvl w:ilvl="0" w:tplc="08090001">
+      <w:start w:val="1"/>
+      <w:numFmt w:val="bullet"/>
+      <w:lvlText w:val=""/>
+      <w:lvlJc w:val="left"/>
+      <w:pPr>
+        <w:ind w:left="720" w:hanging="360"/>
+      </w:pPr>
+      <w:rPr>
+        <w:rFonts w:ascii="Symbol" w:hAnsi="Symbol" w:hint="default"/>
+      </w:rPr>
+    </w:lvl>
+    <w:lvl w:ilvl="1" w:tplc="08090003" w:tentative="1">
+      <w:start w:val="1"/>
+      <w:numFmt w:val="bullet"/>
+      <w:lvlText w:val="o"/>
+      <w:lvlJc w:val="left"/>
+      <w:pPr>
+        <w:ind w:left="1440" w:hanging="360"/>
+      </w:pPr>
+      <w:rPr>
+        <w:rFonts w:ascii="Courier New" w:hAnsi="Courier New" w:cs="Courier New" w:hint="default"/>
+      </w:rPr>
+    </w:lvl>
+    <w:lvl w:ilvl="2" w:tplc="08090005" w:tentative="1">
+      <w:start w:val="1"/>
+      <w:numFmt w:val="bullet"/>
+      <w:lvlText w:val=""/>
+      <w:lvlJc w:val="left"/>
+      <w:pPr>
+        <w:ind w:left="2160" w:hanging="360"/>
+      </w:pPr>
+      <w:rPr>
+        <w:rFonts w:ascii="Wingdings" w:hAnsi="Wingdings" w:hint="default"/>
+      </w:rPr>
+    </w:lvl>
+    <w:lvl w:ilvl="3" w:tplc="08090001" w:tentative="1">
+      <w:start w:val="1"/>
+      <w:numFmt w:val="bullet"/>
+      <w:lvlText w:val=""/>
+      <w:lvlJc w:val="left"/>
+      <w:pPr>
+        <w:ind w:left="2880" w:hanging="360"/>
+      </w:pPr>
+      <w:rPr>
+        <w:rFonts w:ascii="Symbol" w:hAnsi="Symbol" w:hint="default"/>
+      </w:rPr>
+    </w:lvl>
+    <w:lvl w:ilvl="4" w:tplc="08090003" w:tentative="1">
+      <w:start w:val="1"/>
+      <w:numFmt w:val="bullet"/>
+      <w:lvlText w:val="o"/>
+      <w:lvlJc w:val="left"/>
+      <w:pPr>
+        <w:ind w:left="3600" w:hanging="360"/>
+      </w:pPr>
+      <w:rPr>
+        <w:rFonts w:ascii="Courier New" w:hAnsi="Courier New" w:cs="Courier New" w:hint="default"/>
+      </w:rPr>
+    </w:lvl>
+    <w:lvl w:ilvl="5" w:tplc="08090005" w:tentative="1">
+      <w:start w:val="1"/>
+      <w:numFmt w:val="bullet"/>
+      <w:lvlText w:val=""/>
+      <w:lvlJc w:val="left"/>
+      <w:pPr>
+        <w:ind w:left="4320" w:hanging="360"/>
+      </w:pPr>
+      <w:rPr>
+        <w:rFonts w:ascii="Wingdings" w:hAnsi="Wingdings" w:hint="default"/>
+      </w:rPr>
+    </w:lvl>
+    <w:lvl w:ilvl="6" w:tplc="08090001" w:tentative="1">
+      <w:start w:val="1"/>
+      <w:numFmt w:val="bullet"/>
+      <w:lvlText w:val=""/>
+      <w:lvlJc w:val="left"/>
+      <w:pPr>
+        <w:ind w:left="5040" w:hanging="360"/>
+      </w:pPr>
+      <w:rPr>
+        <w:rFonts w:ascii="Symbol" w:hAnsi="Symbol" w:hint="default"/>
+      </w:rPr>
+    </w:lvl>
+    <w:lvl w:ilvl="7" w:tplc="08090003" w:tentative="1">
+      <w:start w:val="1"/>
+      <w:numFmt w:val="bullet"/>
+      <w:lvlText w:val="o"/>
+      <w:lvlJc w:val="left"/>
+      <w:pPr>
+        <w:ind w:left="5760" w:hanging="360"/>
+      </w:pPr>
+      <w:rPr>
+        <w:rFonts w:ascii="Courier New" w:hAnsi="Courier New" w:cs="Courier New" w:hint="default"/>
+      </w:rPr>
+    </w:lvl>
+    <w:lvl w:ilvl="8" w:tplc="08090005" w:tentative="1">
+      <w:start w:val="1"/>
+      <w:numFmt w:val="bullet"/>
+      <w:lvlText w:val=""/>
+      <w:lvlJc w:val="left"/>
+      <w:pPr>
+        <w:ind w:left="6480" w:hanging="360"/>
+      </w:pPr>
+      <w:rPr>
+        <w:rFonts w:ascii="Wingdings" w:hAnsi="Wingdings" w:hint="default"/>
+      </w:rPr>
+    </w:lvl>
+  </w:abstractNum>
+  <w:abstractNum w:abstractNumId="21" w15:restartNumberingAfterBreak="0">
     <w:nsid w:val="6CF67332"/>
     <w:multiLevelType w:val="hybridMultilevel"/>
     <w:tmpl w:val="15D26062"/>
@@ -6629,7 +6973,7 @@
       </w:rPr>
     </w:lvl>
   </w:abstractNum>
-  <w:abstractNum w:abstractNumId="20" w15:restartNumberingAfterBreak="0">
+  <w:abstractNum w:abstractNumId="22" w15:restartNumberingAfterBreak="0">
     <w:nsid w:val="72BF56A5"/>
     <w:multiLevelType w:val="hybridMultilevel"/>
     <w:tmpl w:val="6414DF92"/>
@@ -6742,7 +7086,7 @@
       </w:rPr>
     </w:lvl>
   </w:abstractNum>
-  <w:abstractNum w:abstractNumId="21" w15:restartNumberingAfterBreak="0">
+  <w:abstractNum w:abstractNumId="23" w15:restartNumberingAfterBreak="0">
     <w:nsid w:val="73F54C62"/>
     <w:multiLevelType w:val="hybridMultilevel"/>
     <w:tmpl w:val="452E45BE"/>
@@ -6855,7 +7199,7 @@
       </w:rPr>
     </w:lvl>
   </w:abstractNum>
-  <w:abstractNum w:abstractNumId="22" w15:restartNumberingAfterBreak="0">
+  <w:abstractNum w:abstractNumId="24" w15:restartNumberingAfterBreak="0">
     <w:nsid w:val="78897B67"/>
     <w:multiLevelType w:val="hybridMultilevel"/>
     <w:tmpl w:val="F294998A"/>
@@ -6996,7 +7340,7 @@
     <w:abstractNumId w:val="14"/>
   </w:num>
   <w:num w:numId="10" w16cid:durableId="567612666">
-    <w:abstractNumId w:val="21"/>
+    <w:abstractNumId w:val="23"/>
   </w:num>
   <w:num w:numId="11" w16cid:durableId="2008900165">
     <w:abstractNumId w:val="13"/>
@@ -7005,13 +7349,13 @@
     <w:abstractNumId w:val="3"/>
   </w:num>
   <w:num w:numId="13" w16cid:durableId="1461724788">
-    <w:abstractNumId w:val="17"/>
+    <w:abstractNumId w:val="18"/>
   </w:num>
   <w:num w:numId="14" w16cid:durableId="1067998567">
-    <w:abstractNumId w:val="20"/>
+    <w:abstractNumId w:val="22"/>
   </w:num>
   <w:num w:numId="15" w16cid:durableId="268511707">
-    <w:abstractNumId w:val="22"/>
+    <w:abstractNumId w:val="24"/>
   </w:num>
   <w:num w:numId="16" w16cid:durableId="1097015855">
     <w:abstractNumId w:val="4"/>
@@ -7023,7 +7367,7 @@
     <w:abstractNumId w:val="10"/>
   </w:num>
   <w:num w:numId="19" w16cid:durableId="68580028">
-    <w:abstractNumId w:val="18"/>
+    <w:abstractNumId w:val="19"/>
   </w:num>
   <w:num w:numId="20" w16cid:durableId="419300408">
     <w:abstractNumId w:val="2"/>
@@ -7032,10 +7376,16 @@
     <w:abstractNumId w:val="0"/>
   </w:num>
   <w:num w:numId="22" w16cid:durableId="149565735">
-    <w:abstractNumId w:val="19"/>
+    <w:abstractNumId w:val="21"/>
   </w:num>
   <w:num w:numId="23" w16cid:durableId="157112206">
     <w:abstractNumId w:val="9"/>
+  </w:num>
+  <w:num w:numId="24" w16cid:durableId="1842545179">
+    <w:abstractNumId w:val="20"/>
+  </w:num>
+  <w:num w:numId="25" w16cid:durableId="815031544">
+    <w:abstractNumId w:val="17"/>
   </w:num>
 </w:numbering>
 </file>

</xml_diff>